<commit_message>
Reorganize code into code/ and pic/ folders, add verified references (17 items), update paper and README
</commit_message>
<xml_diff>
--- a/2026数学建模国赛论文.docx
+++ b/2026数学建模国赛论文.docx
@@ -12395,7 +12395,7 @@
           <w:b w:val="0"/>
           <w:sz w:val="21"/>
         </w:rPr>
-        <w:t>[1] 《运筹学》教材编写组. 运筹学[M]. 5版. 北京: 清华大学出版社, 2021.</w:t>
+        <w:t>[1] 鲁宗相, 王彩霞, 闵勇, 等. 微电网研究综述[J]. 电力系统自动化, 2007, 31(19): 100-107.</w:t>
       </w:r>
     </w:p>
     <w:p>
@@ -12408,7 +12408,7 @@
           <w:b w:val="0"/>
           <w:sz w:val="21"/>
         </w:rPr>
-        <w:t>[2] HUANGFU Q, HALL J A J. Parallelizing the dual revised simplex method[J]. Mathematical Programming Computation, 2018, 10(1): 119-142.</w:t>
+        <w:t>[2] 杨新法, 苏剑, 吕志鹏, 等. 微电网技术综述[J]. 中国电机工程学报, 2014, 34(1): 57-70.</w:t>
       </w:r>
     </w:p>
     <w:p>
@@ -12421,7 +12421,7 @@
           <w:b w:val="0"/>
           <w:sz w:val="21"/>
         </w:rPr>
-        <w:t>[3] VIRTANEN P, GOMMERS R, OLIPHANT T E, et al. SciPy 1.0: fundamental algorithms for scientific computing in Python[J]. Nature Methods, 2020, 17(3): 261-272.</w:t>
+        <w:t>[3] 王成山, 武震, 李鹏. 微电网关键技术研究[J]. 电工技术学报, 2014, 29(2): 1-12.</w:t>
       </w:r>
     </w:p>
     <w:p>
@@ -12434,7 +12434,7 @@
           <w:b w:val="0"/>
           <w:sz w:val="21"/>
         </w:rPr>
-        <w:t>[4] 鲁宗相, 王彩霞, 闵勇, 等. 微电网研究综述[J]. 电力系统自动化, 2007, 31(19): 100-107.</w:t>
+        <w:t>[4] 丁明, 张颖媛, 茆美琴, 等. 微网研究中的关键技术[J]. 电网技术, 2009, 33(11): 6-11.</w:t>
       </w:r>
     </w:p>
     <w:p>
@@ -12447,7 +12447,7 @@
           <w:b w:val="0"/>
           <w:sz w:val="21"/>
         </w:rPr>
-        <w:t>[5] 王成山, 李鹏. 分布式发电、微网与智能配电网的发展与挑战[J]. 电力系统自动化, 2010, 34(2): 10-14.</w:t>
+        <w:t>[5] 周林, 黄勇, 郭珂, 等. 微电网储能技术研究综述[J]. 电力系统保护与控制, 2011, 39(7): 147-152.</w:t>
       </w:r>
     </w:p>
     <w:p>
@@ -12460,7 +12460,7 @@
           <w:b w:val="0"/>
           <w:sz w:val="21"/>
         </w:rPr>
-        <w:t>[6] 王成山, 武震, 李鹏. 微电网关键技术研究[J]. 电工技术学报, 2014, 29(2): 1-12.</w:t>
+        <w:t>[6] 李霞林, 郭力, 王成山, 等. 直流微电网关键技术研究综述[J]. 中国电机工程学报, 2016, 36(1): 2-17.</w:t>
       </w:r>
     </w:p>
     <w:p>
@@ -12473,7 +12473,7 @@
           <w:b w:val="0"/>
           <w:sz w:val="21"/>
         </w:rPr>
-        <w:t>[7] 杨新法, 苏剑, 吕志鹏, 等. 微电网技术综述[J]. 中国电机工程学报, 2014, 34(1): 57-70.</w:t>
+        <w:t>[7] 吴雄, 王秀丽, 刘世民, 等. 微电网能量管理系统研究综述[J]. 电力自动化设备, 2014, 34(10): 7-14.</w:t>
       </w:r>
     </w:p>
     <w:p>
@@ -12486,7 +12486,7 @@
           <w:b w:val="0"/>
           <w:sz w:val="21"/>
         </w:rPr>
-        <w:t>[8] 丁明, 张颖媛, 茆美琴. 微网研究中的关键技术[J]. 电网技术, 2009, 33(11): 6-11.</w:t>
+        <w:t>[8] 桑丙玉, 王德顺, 杨波, 等. 平滑新能源输出波动的储能优化配置方法[J]. 中国电机工程学报, 2014, 34(22): 3700-3706.</w:t>
       </w:r>
     </w:p>
     <w:p>
@@ -12499,7 +12499,7 @@
           <w:b w:val="0"/>
           <w:sz w:val="21"/>
         </w:rPr>
-        <w:t>[9] 张建华, 黄伟. 微电网运行控制与保护技术[M]. 北京: 中国电力出版社, 2010.</w:t>
+        <w:t>[9] 张钦, 王锡凡, 付敏, 等. 电力市场下需求响应研究综述[J]. 电力系统自动化, 2008, 32(3): 97-106.</w:t>
       </w:r>
     </w:p>
     <w:p>
@@ -12512,7 +12512,98 @@
           <w:b w:val="0"/>
           <w:sz w:val="21"/>
         </w:rPr>
-        <w:t>[10] GILL P E, MURRAY W, WRIGHT M H. Practical Optimization[M]. London: Academic Press, 1981.</w:t>
+        <w:t>[10] 刘卫亮, 刘长良, 林永君, 等. 计及雾霾影响因素的光伏发电超短期功率预测[J]. 中国电机工程学报, 2018, 38(14): 4086-4095.</w:t>
+      </w:r>
+    </w:p>
+    <w:p>
+      <w:pPr>
+        <w:spacing w:line="360" w:lineRule="auto"/>
+      </w:pPr>
+      <w:r>
+        <w:rPr>
+          <w:rFonts w:ascii="Times New Roman" w:hAnsi="Times New Roman" w:eastAsia="宋体"/>
+          <w:b w:val="0"/>
+          <w:sz w:val="21"/>
+        </w:rPr>
+        <w:t>[11] 《运筹学》教材编写组. 运筹学[M]. 5版. 北京: 清华大学出版社, 2021.</w:t>
+      </w:r>
+    </w:p>
+    <w:p>
+      <w:pPr>
+        <w:spacing w:line="360" w:lineRule="auto"/>
+      </w:pPr>
+      <w:r>
+        <w:rPr>
+          <w:rFonts w:ascii="Times New Roman" w:hAnsi="Times New Roman" w:eastAsia="宋体"/>
+          <w:b w:val="0"/>
+          <w:sz w:val="21"/>
+        </w:rPr>
+        <w:t>[12] 姜启源, 谢金星, 叶俊. 数学模型[M]. 5版. 北京: 高等教育出版社, 2018.</w:t>
+      </w:r>
+    </w:p>
+    <w:p>
+      <w:pPr>
+        <w:spacing w:line="360" w:lineRule="auto"/>
+      </w:pPr>
+      <w:r>
+        <w:rPr>
+          <w:rFonts w:ascii="Times New Roman" w:hAnsi="Times New Roman" w:eastAsia="宋体"/>
+          <w:b w:val="0"/>
+          <w:sz w:val="21"/>
+        </w:rPr>
+        <w:t>[13] 盛骤, 谢式千, 潘承毅. 概率论与数理统计[M]. 4版. 北京: 高等教育出版社, 2008.</w:t>
+      </w:r>
+    </w:p>
+    <w:p>
+      <w:pPr>
+        <w:spacing w:line="360" w:lineRule="auto"/>
+      </w:pPr>
+      <w:r>
+        <w:rPr>
+          <w:rFonts w:ascii="Times New Roman" w:hAnsi="Times New Roman" w:eastAsia="宋体"/>
+          <w:b w:val="0"/>
+          <w:sz w:val="21"/>
+        </w:rPr>
+        <w:t>[14] VIRTANEN P, GOMMERS R, OLIPHANT T E, et al. SciPy 1.0: fundamental algorithms for scientific computing in Python[J]. Nature Methods, 2020, 17(3): 261-272.</w:t>
+      </w:r>
+    </w:p>
+    <w:p>
+      <w:pPr>
+        <w:spacing w:line="360" w:lineRule="auto"/>
+      </w:pPr>
+      <w:r>
+        <w:rPr>
+          <w:rFonts w:ascii="Times New Roman" w:hAnsi="Times New Roman" w:eastAsia="宋体"/>
+          <w:b w:val="0"/>
+          <w:sz w:val="21"/>
+        </w:rPr>
+        <w:t>[15] PALMA-BEHNKE R, BENAVIDES C, LANAS F, et al. A microgrid energy management system based on the rolling horizon strategy[J]. IEEE Transactions on Smart Grid, 2013, 4(2): 996-1006.</w:t>
+      </w:r>
+    </w:p>
+    <w:p>
+      <w:pPr>
+        <w:spacing w:line="360" w:lineRule="auto"/>
+      </w:pPr>
+      <w:r>
+        <w:rPr>
+          <w:rFonts w:ascii="Times New Roman" w:hAnsi="Times New Roman" w:eastAsia="宋体"/>
+          <w:b w:val="0"/>
+          <w:sz w:val="21"/>
+        </w:rPr>
+        <w:t>[16] PARISIO A, RIKOS E, GLIELMO L. A model predictive control approach to microgrid operation optimization[J]. IEEE Transactions on Control Systems Technology, 2014, 22(5): 1813-1827.</w:t>
+      </w:r>
+    </w:p>
+    <w:p>
+      <w:pPr>
+        <w:spacing w:line="360" w:lineRule="auto"/>
+      </w:pPr>
+      <w:r>
+        <w:rPr>
+          <w:rFonts w:ascii="Times New Roman" w:hAnsi="Times New Roman" w:eastAsia="宋体"/>
+          <w:b w:val="0"/>
+          <w:sz w:val="21"/>
+        </w:rPr>
+        <w:t>[17] HUANGFU Q, HALL J A J. Parallelizing the dual revised simplex method[J]. Mathematical Programming Computation, 2018, 10(1): 119-142.</w:t>
       </w:r>
     </w:p>
     <w:p>
@@ -12549,7 +12640,7 @@
           <w:b w:val="0"/>
           <w:sz w:val="24"/>
         </w:rPr>
-        <w:t>（1）q1.py：问题一单日周期线性规划求解程序（生成 result1.xlsx）；</w:t>
+        <w:t>（1）code/q1.py：问题一单日周期线性规划求解程序（生成 result1.xlsx）；</w:t>
       </w:r>
     </w:p>
     <w:p>
@@ -12559,7 +12650,7 @@
           <w:b w:val="0"/>
           <w:sz w:val="24"/>
         </w:rPr>
-        <w:t>（2）q2.py：问题二全年滚动优化求解程序（生成 result2.xlsx 与 q2_log.txt）；</w:t>
+        <w:t>（2）code/q2.py：问题二全年滚动优化求解程序（生成 result2.xlsx 与 q2_log.txt）；</w:t>
       </w:r>
     </w:p>
     <w:p>
@@ -12599,7 +12690,7 @@
           <w:b w:val="0"/>
           <w:sz w:val="24"/>
         </w:rPr>
-        <w:t>（6）q3.py：问题三滚动时域调度求解程序（生成 result3.xlsx 与 q3_log.txt）；</w:t>
+        <w:t>（6）code/q3.py：问题三滚动时域调度求解程序（生成 result3.xlsx 与 q3_log.txt）；</w:t>
       </w:r>
     </w:p>
     <w:p>
@@ -12609,7 +12700,7 @@
           <w:b w:val="0"/>
           <w:sz w:val="24"/>
         </w:rPr>
-        <w:t>（7）q4.py：问题四波动电价重算程序（生成 result4-2.xlsx、result4-3.xlsx 与 q4_log.txt）；</w:t>
+        <w:t>（7）code/q4.py：问题四波动电价重算程序（生成 result4-2.xlsx、result4-3.xlsx 与 q4_log.txt）；</w:t>
       </w:r>
     </w:p>
     <w:p>
@@ -12619,7 +12710,7 @@
           <w:b w:val="0"/>
           <w:sz w:val="24"/>
         </w:rPr>
-        <w:t>（8）lp_core.py：问题一至四共用的线性规划建模与求解核心模块；</w:t>
+        <w:t>（8）code/lp_core.py：问题一至四共用的线性规划建模与求解核心模块；</w:t>
       </w:r>
     </w:p>
     <w:p>
@@ -12659,7 +12750,7 @@
           <w:b w:val="0"/>
           <w:sz w:val="24"/>
         </w:rPr>
-        <w:t>（12）make_figs_q12.py、make_figs_q34.py：论文插图生成程序（生成 pic/ 目录 12 张图）；</w:t>
+        <w:t>（12）pic/qic1.py～qic4.py：问题一至四论文插图生成程序（生成 pic/ 目录 12 张图）；</w:t>
       </w:r>
     </w:p>
     <w:p>
@@ -12669,7 +12760,17 @@
           <w:b w:val="0"/>
           <w:sz w:val="24"/>
         </w:rPr>
-        <w:t>（13）make_paper.py：本论文 Word 文档生成程序。</w:t>
+        <w:t>（13）make_paper.py：本论文 Word 文档生成程序；</w:t>
+      </w:r>
+    </w:p>
+    <w:p>
+      <w:r>
+        <w:rPr>
+          <w:rFonts w:ascii="Times New Roman" w:hAnsi="Times New Roman" w:eastAsia="宋体"/>
+          <w:b w:val="0"/>
+          <w:sz w:val="24"/>
+        </w:rPr>
+        <w:t>（14）thesis/参考文献.docx：可阅读的真实参考文献汇编（知网可查）。</w:t>
       </w:r>
     </w:p>
     <w:p>
@@ -12682,7 +12783,7 @@
           <w:b/>
           <w:sz w:val="28"/>
         </w:rPr>
-        <w:t>附录2  问题一求解程序 q1.py 全文</w:t>
+        <w:t>附录2  问题一求解程序 code/q1.py 全文</w:t>
       </w:r>
     </w:p>
     <w:p>
@@ -12747,6 +12848,19 @@
           <w:b w:val="0"/>
           <w:sz w:val="18"/>
         </w:rPr>
+        <w:t>from pathlib import Path</w:t>
+      </w:r>
+    </w:p>
+    <w:p>
+      <w:pPr>
+        <w:spacing w:line="240" w:lineRule="auto" w:after="0"/>
+      </w:pPr>
+      <w:r>
+        <w:rPr>
+          <w:rFonts w:ascii="Consolas" w:hAnsi="Consolas" w:eastAsia="宋体"/>
+          <w:b w:val="0"/>
+          <w:sz w:val="18"/>
+        </w:rPr>
         <w:t>from scipy.optimize import linprog</w:t>
       </w:r>
     </w:p>
@@ -12812,6 +12926,32 @@
           <w:b w:val="0"/>
           <w:sz w:val="18"/>
         </w:rPr>
+        <w:t>BASE = Path(__file__).resolve().parent.parent</w:t>
+      </w:r>
+    </w:p>
+    <w:p>
+      <w:pPr>
+        <w:spacing w:line="240" w:lineRule="auto" w:after="0"/>
+      </w:pPr>
+      <w:r>
+        <w:rPr>
+          <w:rFonts w:ascii="Consolas" w:hAnsi="Consolas" w:eastAsia="宋体"/>
+          <w:b w:val="0"/>
+          <w:sz w:val="18"/>
+        </w:rPr>
+        <w:t xml:space="preserve"> </w:t>
+      </w:r>
+    </w:p>
+    <w:p>
+      <w:pPr>
+        <w:spacing w:line="240" w:lineRule="auto" w:after="0"/>
+      </w:pPr>
+      <w:r>
+        <w:rPr>
+          <w:rFonts w:ascii="Consolas" w:hAnsi="Consolas" w:eastAsia="宋体"/>
+          <w:b w:val="0"/>
+          <w:sz w:val="18"/>
+        </w:rPr>
         <w:t>DT = 1.0 / 6.0          # 10 min in hours</w:t>
       </w:r>
     </w:p>
@@ -12903,7 +13043,7 @@
           <w:b w:val="0"/>
           <w:sz w:val="18"/>
         </w:rPr>
-        <w:t>a1 = pd.read_excel('附件/附件1.xlsx')</w:t>
+        <w:t>a1 = pd.read_excel(BASE / '附件/附件1.xlsx')</w:t>
       </w:r>
     </w:p>
     <w:p>
@@ -13878,20 +14018,33 @@
           <w:b w:val="0"/>
           <w:sz w:val="18"/>
         </w:rPr>
-        <w:t>shutil.copy('附件/附件5/result1.xlsx', 'result1.xlsx')</w:t>
-      </w:r>
-    </w:p>
-    <w:p>
-      <w:pPr>
-        <w:spacing w:line="240" w:lineRule="auto" w:after="0"/>
-      </w:pPr>
-      <w:r>
-        <w:rPr>
-          <w:rFonts w:ascii="Consolas" w:hAnsi="Consolas" w:eastAsia="宋体"/>
-          <w:b w:val="0"/>
-          <w:sz w:val="18"/>
-        </w:rPr>
-        <w:t>wb = load_workbook('result1.xlsx')</w:t>
+        <w:t>OUT1 = BASE / 'result1.xlsx'</w:t>
+      </w:r>
+    </w:p>
+    <w:p>
+      <w:pPr>
+        <w:spacing w:line="240" w:lineRule="auto" w:after="0"/>
+      </w:pPr>
+      <w:r>
+        <w:rPr>
+          <w:rFonts w:ascii="Consolas" w:hAnsi="Consolas" w:eastAsia="宋体"/>
+          <w:b w:val="0"/>
+          <w:sz w:val="18"/>
+        </w:rPr>
+        <w:t>shutil.copy(BASE / '附件/附件5/result1.xlsx', OUT1)</w:t>
+      </w:r>
+    </w:p>
+    <w:p>
+      <w:pPr>
+        <w:spacing w:line="240" w:lineRule="auto" w:after="0"/>
+      </w:pPr>
+      <w:r>
+        <w:rPr>
+          <w:rFonts w:ascii="Consolas" w:hAnsi="Consolas" w:eastAsia="宋体"/>
+          <w:b w:val="0"/>
+          <w:sz w:val="18"/>
+        </w:rPr>
+        <w:t>wb = load_workbook(OUT1)</w:t>
       </w:r>
     </w:p>
     <w:p>
@@ -14021,7 +14174,7 @@
           <w:b w:val="0"/>
           <w:sz w:val="18"/>
         </w:rPr>
-        <w:t>wb.save('result1.xlsx')</w:t>
+        <w:t>wb.save(OUT1)</w:t>
       </w:r>
     </w:p>
     <w:p>
@@ -14047,7 +14200,7 @@
           <w:b/>
           <w:sz w:val="28"/>
         </w:rPr>
-        <w:t>附录3  问题二求解程序 q2.py 全文</w:t>
+        <w:t>附录3  问题二求解程序 code/q2.py 全文</w:t>
       </w:r>
     </w:p>
     <w:p>
@@ -14112,6 +14265,19 @@
           <w:b w:val="0"/>
           <w:sz w:val="18"/>
         </w:rPr>
+        <w:t>from pathlib import Path</w:t>
+      </w:r>
+    </w:p>
+    <w:p>
+      <w:pPr>
+        <w:spacing w:line="240" w:lineRule="auto" w:after="0"/>
+      </w:pPr>
+      <w:r>
+        <w:rPr>
+          <w:rFonts w:ascii="Consolas" w:hAnsi="Consolas" w:eastAsia="宋体"/>
+          <w:b w:val="0"/>
+          <w:sz w:val="18"/>
+        </w:rPr>
         <w:t>from scipy.optimize import linprog</w:t>
       </w:r>
     </w:p>
@@ -14177,6 +14343,32 @@
           <w:b w:val="0"/>
           <w:sz w:val="18"/>
         </w:rPr>
+        <w:t>BASE = Path(__file__).resolve().parent.parent</w:t>
+      </w:r>
+    </w:p>
+    <w:p>
+      <w:pPr>
+        <w:spacing w:line="240" w:lineRule="auto" w:after="0"/>
+      </w:pPr>
+      <w:r>
+        <w:rPr>
+          <w:rFonts w:ascii="Consolas" w:hAnsi="Consolas" w:eastAsia="宋体"/>
+          <w:b w:val="0"/>
+          <w:sz w:val="18"/>
+        </w:rPr>
+        <w:t xml:space="preserve"> </w:t>
+      </w:r>
+    </w:p>
+    <w:p>
+      <w:pPr>
+        <w:spacing w:line="240" w:lineRule="auto" w:after="0"/>
+      </w:pPr>
+      <w:r>
+        <w:rPr>
+          <w:rFonts w:ascii="Consolas" w:hAnsi="Consolas" w:eastAsia="宋体"/>
+          <w:b w:val="0"/>
+          <w:sz w:val="18"/>
+        </w:rPr>
         <w:t>DT = 1.0 / 6.0</w:t>
       </w:r>
     </w:p>
@@ -14268,7 +14460,7 @@
           <w:b w:val="0"/>
           <w:sz w:val="18"/>
         </w:rPr>
-        <w:t>log = io.open('q2_log.txt', 'w', encoding='utf-8')</w:t>
+        <w:t>log = io.open(BASE / 'q2_log.txt', 'w', encoding='utf-8')</w:t>
       </w:r>
     </w:p>
     <w:p>
@@ -14359,7 +14551,7 @@
           <w:b w:val="0"/>
           <w:sz w:val="18"/>
         </w:rPr>
-        <w:t>a1 = pd.read_excel('附件/附件1.xlsx')</w:t>
+        <w:t>a1 = pd.read_excel(BASE / '附件/附件1.xlsx')</w:t>
       </w:r>
     </w:p>
     <w:p>
@@ -14385,20 +14577,20 @@
           <w:b w:val="0"/>
           <w:sz w:val="18"/>
         </w:rPr>
-        <w:t>load_df = pd.read_excel('附件/附件2.xlsx', sheet_name='小区负载')</w:t>
-      </w:r>
-    </w:p>
-    <w:p>
-      <w:pPr>
-        <w:spacing w:line="240" w:lineRule="auto" w:after="0"/>
-      </w:pPr>
-      <w:r>
-        <w:rPr>
-          <w:rFonts w:ascii="Consolas" w:hAnsi="Consolas" w:eastAsia="宋体"/>
-          <w:b w:val="0"/>
-          <w:sz w:val="18"/>
-        </w:rPr>
-        <w:t>pv_df   = pd.read_excel('附件/附件2.xlsx', sheet_name='光伏发电实际功率')</w:t>
+        <w:t>load_df = pd.read_excel(BASE / '附件/附件2.xlsx', sheet_name='小区负载')</w:t>
+      </w:r>
+    </w:p>
+    <w:p>
+      <w:pPr>
+        <w:spacing w:line="240" w:lineRule="auto" w:after="0"/>
+      </w:pPr>
+      <w:r>
+        <w:rPr>
+          <w:rFonts w:ascii="Consolas" w:hAnsi="Consolas" w:eastAsia="宋体"/>
+          <w:b w:val="0"/>
+          <w:sz w:val="18"/>
+        </w:rPr>
+        <w:t>pv_df   = pd.read_excel(BASE / '附件/附件2.xlsx', sheet_name='光伏发电实际功率')</w:t>
       </w:r>
     </w:p>
     <w:p>
@@ -15529,20 +15721,33 @@
           <w:b w:val="0"/>
           <w:sz w:val="18"/>
         </w:rPr>
-        <w:t>shutil.copy('附件/附件5/result2.xlsx', 'result2.xlsx')</w:t>
-      </w:r>
-    </w:p>
-    <w:p>
-      <w:pPr>
-        <w:spacing w:line="240" w:lineRule="auto" w:after="0"/>
-      </w:pPr>
-      <w:r>
-        <w:rPr>
-          <w:rFonts w:ascii="Consolas" w:hAnsi="Consolas" w:eastAsia="宋体"/>
-          <w:b w:val="0"/>
-          <w:sz w:val="18"/>
-        </w:rPr>
-        <w:t>wb = load_workbook('result2.xlsx')</w:t>
+        <w:t>OUT2 = BASE / 'result2.xlsx'</w:t>
+      </w:r>
+    </w:p>
+    <w:p>
+      <w:pPr>
+        <w:spacing w:line="240" w:lineRule="auto" w:after="0"/>
+      </w:pPr>
+      <w:r>
+        <w:rPr>
+          <w:rFonts w:ascii="Consolas" w:hAnsi="Consolas" w:eastAsia="宋体"/>
+          <w:b w:val="0"/>
+          <w:sz w:val="18"/>
+        </w:rPr>
+        <w:t>shutil.copy(BASE / '附件/附件5/result2.xlsx', OUT2)</w:t>
+      </w:r>
+    </w:p>
+    <w:p>
+      <w:pPr>
+        <w:spacing w:line="240" w:lineRule="auto" w:after="0"/>
+      </w:pPr>
+      <w:r>
+        <w:rPr>
+          <w:rFonts w:ascii="Consolas" w:hAnsi="Consolas" w:eastAsia="宋体"/>
+          <w:b w:val="0"/>
+          <w:sz w:val="18"/>
+        </w:rPr>
+        <w:t>wb = load_workbook(OUT2)</w:t>
       </w:r>
     </w:p>
     <w:p>
@@ -16270,7 +16475,7 @@
           <w:b w:val="0"/>
           <w:sz w:val="18"/>
         </w:rPr>
-        <w:t>wb.save('result2.xlsx')</w:t>
+        <w:t>wb.save(OUT2)</w:t>
       </w:r>
     </w:p>
     <w:p>
@@ -16309,7 +16514,7 @@
           <w:b/>
           <w:sz w:val="28"/>
         </w:rPr>
-        <w:t>附录4  模型构建核心模块 lp_core.py 全文</w:t>
+        <w:t>附录4  模型构建核心模块 code/lp_core.py 全文</w:t>
       </w:r>
     </w:p>
     <w:p>
@@ -16413,6 +16618,19 @@
           <w:b w:val="0"/>
           <w:sz w:val="18"/>
         </w:rPr>
+        <w:t>from pathlib import Path</w:t>
+      </w:r>
+    </w:p>
+    <w:p>
+      <w:pPr>
+        <w:spacing w:line="240" w:lineRule="auto" w:after="0"/>
+      </w:pPr>
+      <w:r>
+        <w:rPr>
+          <w:rFonts w:ascii="Consolas" w:hAnsi="Consolas" w:eastAsia="宋体"/>
+          <w:b w:val="0"/>
+          <w:sz w:val="18"/>
+        </w:rPr>
         <w:t>from scipy.optimize import linprog</w:t>
       </w:r>
     </w:p>
@@ -16452,6 +16670,32 @@
           <w:b w:val="0"/>
           <w:sz w:val="18"/>
         </w:rPr>
+        <w:t>BASE = Path(__file__).resolve().parent.parent</w:t>
+      </w:r>
+    </w:p>
+    <w:p>
+      <w:pPr>
+        <w:spacing w:line="240" w:lineRule="auto" w:after="0"/>
+      </w:pPr>
+      <w:r>
+        <w:rPr>
+          <w:rFonts w:ascii="Consolas" w:hAnsi="Consolas" w:eastAsia="宋体"/>
+          <w:b w:val="0"/>
+          <w:sz w:val="18"/>
+        </w:rPr>
+        <w:t xml:space="preserve"> </w:t>
+      </w:r>
+    </w:p>
+    <w:p>
+      <w:pPr>
+        <w:spacing w:line="240" w:lineRule="auto" w:after="0"/>
+      </w:pPr>
+      <w:r>
+        <w:rPr>
+          <w:rFonts w:ascii="Consolas" w:hAnsi="Consolas" w:eastAsia="宋体"/>
+          <w:b w:val="0"/>
+          <w:sz w:val="18"/>
+        </w:rPr>
         <w:t>DT = 1.0 / 6.0</w:t>
       </w:r>
     </w:p>
@@ -16712,7 +16956,7 @@
           <w:b w:val="0"/>
           <w:sz w:val="18"/>
         </w:rPr>
-        <w:t xml:space="preserve">    a1 = pd.read_excel('附件/附件1.xlsx')</w:t>
+        <w:t xml:space="preserve">    a1 = pd.read_excel(BASE / '附件/附件1.xlsx')</w:t>
       </w:r>
     </w:p>
     <w:p>
@@ -16738,20 +16982,20 @@
           <w:b w:val="0"/>
           <w:sz w:val="18"/>
         </w:rPr>
-        <w:t xml:space="preserve">    load_df = pd.read_excel('附件/附件2.xlsx', sheet_name='小区负载')</w:t>
-      </w:r>
-    </w:p>
-    <w:p>
-      <w:pPr>
-        <w:spacing w:line="240" w:lineRule="auto" w:after="0"/>
-      </w:pPr>
-      <w:r>
-        <w:rPr>
-          <w:rFonts w:ascii="Consolas" w:hAnsi="Consolas" w:eastAsia="宋体"/>
-          <w:b w:val="0"/>
-          <w:sz w:val="18"/>
-        </w:rPr>
-        <w:t xml:space="preserve">    pv_df = pd.read_excel('附件/附件2.xlsx', sheet_name='光伏发电实际功率')</w:t>
+        <w:t xml:space="preserve">    load_df = pd.read_excel(BASE / '附件/附件2.xlsx', sheet_name='小区负载')</w:t>
+      </w:r>
+    </w:p>
+    <w:p>
+      <w:pPr>
+        <w:spacing w:line="240" w:lineRule="auto" w:after="0"/>
+      </w:pPr>
+      <w:r>
+        <w:rPr>
+          <w:rFonts w:ascii="Consolas" w:hAnsi="Consolas" w:eastAsia="宋体"/>
+          <w:b w:val="0"/>
+          <w:sz w:val="18"/>
+        </w:rPr>
+        <w:t xml:space="preserve">    pv_df = pd.read_excel(BASE / '附件/附件2.xlsx', sheet_name='光伏发电实际功率')</w:t>
       </w:r>
     </w:p>
     <w:p>
@@ -16803,7 +17047,7 @@
           <w:b w:val="0"/>
           <w:sz w:val="18"/>
         </w:rPr>
-        <w:t xml:space="preserve">    a4 = pd.read_excel('附件/附件4.xlsx')</w:t>
+        <w:t xml:space="preserve">    a4 = pd.read_excel(BASE / '附件/附件4.xlsx')</w:t>
       </w:r>
     </w:p>
     <w:p>
@@ -16829,7 +17073,7 @@
           <w:b w:val="0"/>
           <w:sz w:val="18"/>
         </w:rPr>
-        <w:t xml:space="preserve">    a3 = pd.read_excel('附件/附件3.xlsx')</w:t>
+        <w:t xml:space="preserve">    a3 = pd.read_excel(BASE / '附件/附件3.xlsx')</w:t>
       </w:r>
     </w:p>
     <w:p>
@@ -19780,7 +20024,7 @@
           <w:b/>
           <w:sz w:val="28"/>
         </w:rPr>
-        <w:t>附录5  问题三求解程序 q3.py 全文</w:t>
+        <w:t>附录5  问题三求解程序 code/q3.py 全文</w:t>
       </w:r>
     </w:p>
     <w:p>
@@ -19910,6 +20154,19 @@
           <w:b w:val="0"/>
           <w:sz w:val="18"/>
         </w:rPr>
+        <w:t>from pathlib import Path</w:t>
+      </w:r>
+    </w:p>
+    <w:p>
+      <w:pPr>
+        <w:spacing w:line="240" w:lineRule="auto" w:after="0"/>
+      </w:pPr>
+      <w:r>
+        <w:rPr>
+          <w:rFonts w:ascii="Consolas" w:hAnsi="Consolas" w:eastAsia="宋体"/>
+          <w:b w:val="0"/>
+          <w:sz w:val="18"/>
+        </w:rPr>
         <w:t>from openpyxl import load_workbook</w:t>
       </w:r>
     </w:p>
@@ -19975,6 +20232,32 @@
           <w:b w:val="0"/>
           <w:sz w:val="18"/>
         </w:rPr>
+        <w:t>BASE = Path(__file__).resolve().parent.parent</w:t>
+      </w:r>
+    </w:p>
+    <w:p>
+      <w:pPr>
+        <w:spacing w:line="240" w:lineRule="auto" w:after="0"/>
+      </w:pPr>
+      <w:r>
+        <w:rPr>
+          <w:rFonts w:ascii="Consolas" w:hAnsi="Consolas" w:eastAsia="宋体"/>
+          <w:b w:val="0"/>
+          <w:sz w:val="18"/>
+        </w:rPr>
+        <w:t xml:space="preserve"> </w:t>
+      </w:r>
+    </w:p>
+    <w:p>
+      <w:pPr>
+        <w:spacing w:line="240" w:lineRule="auto" w:after="0"/>
+      </w:pPr>
+      <w:r>
+        <w:rPr>
+          <w:rFonts w:ascii="Consolas" w:hAnsi="Consolas" w:eastAsia="宋体"/>
+          <w:b w:val="0"/>
+          <w:sz w:val="18"/>
+        </w:rPr>
         <w:t>t_start = time.time()</w:t>
       </w:r>
     </w:p>
@@ -20079,7 +20362,7 @@
           <w:b w:val="0"/>
           <w:sz w:val="18"/>
         </w:rPr>
-        <w:t>BAK = '附件/附件5/templates_bak'</w:t>
+        <w:t>BAK = BASE / '附件/附件5/templates_bak'</w:t>
       </w:r>
     </w:p>
     <w:p>
@@ -20131,7 +20414,7 @@
           <w:b w:val="0"/>
           <w:sz w:val="18"/>
         </w:rPr>
-        <w:t xml:space="preserve">        shutil.copy(os.path.join('附件/附件5', f), os.path.join(BAK, f))</w:t>
+        <w:t xml:space="preserve">        shutil.copy(BASE / '附件/附件5' / f, BAK / f)</w:t>
       </w:r>
     </w:p>
     <w:p>
@@ -22016,7 +22299,20 @@
           <w:b w:val="0"/>
           <w:sz w:val="18"/>
         </w:rPr>
-        <w:t>n_em = write_result(os.path.join(BAK, 'result3.xlsx'), 'result3.xlsx',</w:t>
+        <w:t>OUT3 = BASE / 'result3.xlsx'</w:t>
+      </w:r>
+    </w:p>
+    <w:p>
+      <w:pPr>
+        <w:spacing w:line="240" w:lineRule="auto" w:after="0"/>
+      </w:pPr>
+      <w:r>
+        <w:rPr>
+          <w:rFonts w:ascii="Consolas" w:hAnsi="Consolas" w:eastAsia="宋体"/>
+          <w:b w:val="0"/>
+          <w:sz w:val="18"/>
+        </w:rPr>
+        <w:t>n_em = write_result(BAK / 'result3.xlsx', OUT3,</w:t>
       </w:r>
     </w:p>
     <w:p>
@@ -22042,7 +22338,7 @@
           <w:b w:val="0"/>
           <w:sz w:val="18"/>
         </w:rPr>
-        <w:t>shutil.copy('result3.xlsx', '附件/附件5/result3.xlsx')</w:t>
+        <w:t>shutil.copy(OUT3, BASE / '附件/附件5/result3.xlsx')</w:t>
       </w:r>
     </w:p>
     <w:p>
@@ -22094,7 +22390,7 @@
           <w:b w:val="0"/>
           <w:sz w:val="18"/>
         </w:rPr>
-        <w:t>wb = load_workbook('result3.xlsx', read_only=True)</w:t>
+        <w:t>wb = load_workbook(OUT3, read_only=True)</w:t>
       </w:r>
     </w:p>
     <w:p>
@@ -22185,7 +22481,7 @@
           <w:b w:val="0"/>
           <w:sz w:val="18"/>
         </w:rPr>
-        <w:t>wb = load_workbook('result3.xlsx', read_only=True)</w:t>
+        <w:t>wb = load_workbook(OUT3, read_only=True)</w:t>
       </w:r>
     </w:p>
     <w:p>
@@ -22302,7 +22598,7 @@
           <w:b w:val="0"/>
           <w:sz w:val="18"/>
         </w:rPr>
-        <w:t>with open('q3_log.txt', 'w', encoding='utf-8') as f:</w:t>
+        <w:t>with open(BASE / 'q3_log.txt', 'w', encoding='utf-8') as f:</w:t>
       </w:r>
     </w:p>
     <w:p>
@@ -22341,7 +22637,7 @@
           <w:b/>
           <w:sz w:val="28"/>
         </w:rPr>
-        <w:t>附录6  问题四求解程序 q4.py 全文</w:t>
+        <w:t>附录6  问题四求解程序 code/q4.py 全文</w:t>
       </w:r>
     </w:p>
     <w:p>
@@ -22445,6 +22741,19 @@
           <w:b w:val="0"/>
           <w:sz w:val="18"/>
         </w:rPr>
+        <w:t>from pathlib import Path</w:t>
+      </w:r>
+    </w:p>
+    <w:p>
+      <w:pPr>
+        <w:spacing w:line="240" w:lineRule="auto" w:after="0"/>
+      </w:pPr>
+      <w:r>
+        <w:rPr>
+          <w:rFonts w:ascii="Consolas" w:hAnsi="Consolas" w:eastAsia="宋体"/>
+          <w:b w:val="0"/>
+          <w:sz w:val="18"/>
+        </w:rPr>
         <w:t>from openpyxl import load_workbook</w:t>
       </w:r>
     </w:p>
@@ -22510,6 +22819,32 @@
           <w:b w:val="0"/>
           <w:sz w:val="18"/>
         </w:rPr>
+        <w:t>BASE = Path(__file__).resolve().parent.parent</w:t>
+      </w:r>
+    </w:p>
+    <w:p>
+      <w:pPr>
+        <w:spacing w:line="240" w:lineRule="auto" w:after="0"/>
+      </w:pPr>
+      <w:r>
+        <w:rPr>
+          <w:rFonts w:ascii="Consolas" w:hAnsi="Consolas" w:eastAsia="宋体"/>
+          <w:b w:val="0"/>
+          <w:sz w:val="18"/>
+        </w:rPr>
+        <w:t xml:space="preserve"> </w:t>
+      </w:r>
+    </w:p>
+    <w:p>
+      <w:pPr>
+        <w:spacing w:line="240" w:lineRule="auto" w:after="0"/>
+      </w:pPr>
+      <w:r>
+        <w:rPr>
+          <w:rFonts w:ascii="Consolas" w:hAnsi="Consolas" w:eastAsia="宋体"/>
+          <w:b w:val="0"/>
+          <w:sz w:val="18"/>
+        </w:rPr>
         <w:t>t_start = time.time()</w:t>
       </w:r>
     </w:p>
@@ -22601,7 +22936,7 @@
           <w:b w:val="0"/>
           <w:sz w:val="18"/>
         </w:rPr>
-        <w:t>BAK = '附件/附件5/templates_bak'</w:t>
+        <w:t>BAK = BASE / '附件/附件5/templates_bak'</w:t>
       </w:r>
     </w:p>
     <w:p>
@@ -24226,7 +24561,33 @@
           <w:b w:val="0"/>
           <w:sz w:val="18"/>
         </w:rPr>
-        <w:t>n_em2 = write_result(os.path.join(BAK, 'result4-2.xlsx'), 'result4-2.xlsx',</w:t>
+        <w:t>OUT42 = BASE / 'result4-2.xlsx'</w:t>
+      </w:r>
+    </w:p>
+    <w:p>
+      <w:pPr>
+        <w:spacing w:line="240" w:lineRule="auto" w:after="0"/>
+      </w:pPr>
+      <w:r>
+        <w:rPr>
+          <w:rFonts w:ascii="Consolas" w:hAnsi="Consolas" w:eastAsia="宋体"/>
+          <w:b w:val="0"/>
+          <w:sz w:val="18"/>
+        </w:rPr>
+        <w:t>OUT43 = BASE / 'result4-3.xlsx'</w:t>
+      </w:r>
+    </w:p>
+    <w:p>
+      <w:pPr>
+        <w:spacing w:line="240" w:lineRule="auto" w:after="0"/>
+      </w:pPr>
+      <w:r>
+        <w:rPr>
+          <w:rFonts w:ascii="Consolas" w:hAnsi="Consolas" w:eastAsia="宋体"/>
+          <w:b w:val="0"/>
+          <w:sz w:val="18"/>
+        </w:rPr>
+        <w:t>n_em2 = write_result(BAK / 'result4-2.xlsx', OUT42,</w:t>
       </w:r>
     </w:p>
     <w:p>
@@ -24252,20 +24613,20 @@
           <w:b w:val="0"/>
           <w:sz w:val="18"/>
         </w:rPr>
-        <w:t>shutil.copy('result4-2.xlsx', '附件/附件5/result4-2.xlsx')</w:t>
-      </w:r>
-    </w:p>
-    <w:p>
-      <w:pPr>
-        <w:spacing w:line="240" w:lineRule="auto" w:after="0"/>
-      </w:pPr>
-      <w:r>
-        <w:rPr>
-          <w:rFonts w:ascii="Consolas" w:hAnsi="Consolas" w:eastAsia="宋体"/>
-          <w:b w:val="0"/>
-          <w:sz w:val="18"/>
-        </w:rPr>
-        <w:t>n_em3 = write_result(os.path.join(BAK, 'result4-3.xlsx'), 'result4-3.xlsx',</w:t>
+        <w:t>shutil.copy(OUT42, BASE / '附件/附件5/result4-2.xlsx')</w:t>
+      </w:r>
+    </w:p>
+    <w:p>
+      <w:pPr>
+        <w:spacing w:line="240" w:lineRule="auto" w:after="0"/>
+      </w:pPr>
+      <w:r>
+        <w:rPr>
+          <w:rFonts w:ascii="Consolas" w:hAnsi="Consolas" w:eastAsia="宋体"/>
+          <w:b w:val="0"/>
+          <w:sz w:val="18"/>
+        </w:rPr>
+        <w:t>n_em3 = write_result(BAK / 'result4-3.xlsx', OUT43,</w:t>
       </w:r>
     </w:p>
     <w:p>
@@ -24291,7 +24652,7 @@
           <w:b w:val="0"/>
           <w:sz w:val="18"/>
         </w:rPr>
-        <w:t>shutil.copy('result4-3.xlsx', '附件/附件5/result4-3.xlsx')</w:t>
+        <w:t>shutil.copy(OUT43, BASE / '附件/附件5/result4-3.xlsx')</w:t>
       </w:r>
     </w:p>
     <w:p>
@@ -24343,7 +24704,7 @@
           <w:b w:val="0"/>
           <w:sz w:val="18"/>
         </w:rPr>
-        <w:t>wb = load_workbook('result4-2.xlsx', read_only=True)</w:t>
+        <w:t>wb = load_workbook(OUT42, read_only=True)</w:t>
       </w:r>
     </w:p>
     <w:p>
@@ -24434,7 +24795,7 @@
           <w:b w:val="0"/>
           <w:sz w:val="18"/>
         </w:rPr>
-        <w:t>wb = load_workbook('result4-3.xlsx', read_only=True)</w:t>
+        <w:t>wb = load_workbook(OUT43, read_only=True)</w:t>
       </w:r>
     </w:p>
     <w:p>
@@ -24590,7 +24951,7 @@
           <w:b w:val="0"/>
           <w:sz w:val="18"/>
         </w:rPr>
-        <w:t>with open('q4_log.txt', 'w', encoding='utf-8') as f:</w:t>
+        <w:t>with open(BASE / 'q4_log.txt', 'w', encoding='utf-8') as f:</w:t>
       </w:r>
     </w:p>
     <w:p>

</xml_diff>